<commit_message>
docs: update Team Guide — eleven figures, add Figure 11 four-way comparison entry
</commit_message>
<xml_diff>
--- a/APPM4360_Team_Guide.docx
+++ b/APPM4360_Team_Guide.docx
@@ -10582,7 +10582,7 @@
           <w:sz w:val="22"/>
           <w:szCs w:val="22"/>
         </w:rPr>
-        <w:t>When everything works, you should be able to produce ten figures across four physical models:</w:t>
+        <w:t>When everything works, you should be able to produce eleven figures across four physical models:</w:t>
       </w:r>
     </w:p>
     <w:p>
@@ -11534,6 +11534,16 @@
           <w:sz w:val="22"/>
           <w:szCs w:val="22"/>
         </w:rPr>
+      </w:r>
+    </w:p>
+    <w:p>
+      <w:r>
+        <w:t>Figure 11 - Four-Way Comparison (all models)</w:t>
+      </w:r>
+    </w:p>
+    <w:p>
+      <w:r>
+        <w:t>Four-way side-by-side: uniform flow / terrain-corrected / urban obstacle / road-vortex at the same contour levels. Each panel shows the progressive physical enrichment of the SC framework, from ideal parallel flow to a doubly-connected, terrain- and circulation-informed model. The four potentials are evaluated on the same forward-mapped grid so panel-to-panel differences are due entirely to the physical corrections.</w:t>
       </w:r>
     </w:p>
     <w:p>

</xml_diff>

<commit_message>
docs: fix Team Guide figure count (eleven) and add standalone Fig 9/10 descriptions
</commit_message>
<xml_diff>
--- a/APPM4360_Team_Guide.docx
+++ b/APPM4360_Team_Guide.docx
@@ -2454,7 +2454,7 @@
           <w:sz w:val="22"/>
           <w:szCs w:val="22"/>
         </w:rPr>
-        <w:t>Once the figures are produced, your job is to write the in-text discussion. There are now ten figures. For Figures 2-4 (uniform flow), discuss:</w:t>
+        <w:t>Once the figures are produced, your job is to write the in-text discussion. There are now eleven figures. For Figures 2-4 (uniform flow), discuss:</w:t>
       </w:r>
     </w:p>
     <w:p>
@@ -11429,12 +11429,17 @@
     </w:p>
     <w:p>
       <w:r>
+        <w:t>Point vortices placed at the 11 highest-degree OSM road intersections (primary/secondary/tertiary roads). Intersection pre-images in ℍ found via SC inverse map. Vortex strength proportional to node degree; sign positive (CCW) north of the polygon centroid, negative (CW) south. Streamlines show local eddies at each intersection, consistent with Boulder's prevailing westerly-flow shear from the Flatirons.</w:t>
+      </w:r>
+    </w:p>
+    <w:p>
+      <w:r>
         <w:t>Figure 10 - Uniform vs. Road-Vortex Comparison</w:t>
       </w:r>
     </w:p>
     <w:p>
       <w:r>
-        <w:t>Point vortices placed at the 11 highest-degree OSM road intersections (primary/secondary/tertiary roads). Intersection pre-images in H found via SC inverse map. Vortex strength proportional to node degree; positive (CCW) north of centroid, negative (CW) south. Streamlines in Fig 9 show local eddies at each intersection; Fig 10 compares directly with the uniform baseline, highlighting the circulation induced along the Broadway and 28th St corridors.</w:t>
+        <w:t>Direct side-by-side comparison of uniform flow and road-vortex flow at identical contour levels. The road-vortex correction introduces organised local circulation absent from the uniform baseline, particularly along the Broadway and 28th St corridors.</w:t>
       </w:r>
     </w:p>
     <w:p>

</xml_diff>

<commit_message>
docs: major Team Guide rewrite — add Step 2.5 angle smoothing, fix solver details, terrain pipeline; PDF via Word
</commit_message>
<xml_diff>
--- a/APPM4360_Team_Guide.docx
+++ b/APPM4360_Team_Guide.docx
@@ -7128,7 +7128,7 @@
           <w:sz w:val="22"/>
           <w:szCs w:val="22"/>
         </w:rPr>
-        <w:t xml:space="preserve">The raw city boundary has hundreds of vertices. SC solvers become unstable for n &gt; ~20. Simplify to 10-16 vertices:</w:t>
+        <w:t>The raw city boundary has 1935 vertices. SC solvers become numerically unstable for n &gt; ~20 (pre-vertices cluster — the 'crowding problem'). Simplify to the target range [min_vertices, max_vertices] using Douglas-Peucker with an adaptive binary-search tolerance:</w:t>
       </w:r>
     </w:p>
     <w:p>
@@ -7143,7 +7143,25 @@
           <w:sz w:val="19"/>
           <w:szCs w:val="19"/>
         </w:rPr>
-        <w:t xml:space="preserve">simplified = boulder.simplify(tolerance=500, preserve_topology=True)</w:t>
+        <w:t># src/polygon.py  simplify_polygon()  —  adaptive binary search</w:t>
+        <w:br/>
+        <w:t>lo, hi = 1.0, tolerance * 20.0   # bracket the tolerance</w:t>
+        <w:br/>
+        <w:t>for _ in range(50):</w:t>
+        <w:br/>
+        <w:t xml:space="preserve">    simplified = polygon.simplify(tol, preserve_topology=True)</w:t>
+        <w:br/>
+        <w:t xml:space="preserve">    n = len(simplified.exterior.coords) - 1</w:t>
+        <w:br/>
+        <w:t xml:space="preserve">    if min_vertices &lt;= n &lt;= max_vertices: break</w:t>
+        <w:br/>
+        <w:t xml:space="preserve">    if n &gt; max_vertices: lo = tol</w:t>
+        <w:br/>
+        <w:t xml:space="preserve">    else:                hi = tol</w:t>
+        <w:br/>
+        <w:t xml:space="preserve">    tol = (lo + hi) / 2.0</w:t>
+        <w:br/>
+        <w:t># Boulder converges to ~240 m tolerance, 11 vertices after angle smoothing</w:t>
       </w:r>
     </w:p>
     <w:p>
@@ -7416,6 +7434,54 @@
       <w:pPr>
         <w:spacing w:before="0" w:after="120"/>
       </w:pPr>
+    </w:p>
+    <w:p>
+      <w:r>
+        <w:t>Step 2.5 - Angle Smoothing (prevent SC crowding)</w:t>
+      </w:r>
+    </w:p>
+    <w:p>
+      <w:r>
+        <w:t>Even after Douglas-Peucker, some vertices may have interior angles outside [alpha_min * pi, alpha_max * pi]. These cause SC crowding: the corresponding pre-vertices collapse to machine-epsilon distance from each other, making all quadrature integrals inaccurate. Remove them iteratively before solving:</w:t>
+      </w:r>
+    </w:p>
+    <w:p>
+      <w:r>
+        <w:t># src/polygon.py  smooth_extreme_angles()</w:t>
+        <w:br/>
+        <w:t>from src.angles import interior_angles_pi</w:t>
+        <w:br/>
+        <w:br/>
+        <w:t>alpha_min, alpha_max = 0.15, 1.85   # in units of pi</w:t>
+        <w:br/>
+        <w:t>changed = True</w:t>
+        <w:br/>
+        <w:t>while changed and len(z_poly) &gt; min_vertices:</w:t>
+        <w:br/>
+        <w:t xml:space="preserve">    changed = False</w:t>
+        <w:br/>
+        <w:t xml:space="preserve">    alphas = interior_angles_pi(z_poly)</w:t>
+        <w:br/>
+        <w:t xml:space="preserve">    severity = np.maximum(alpha_min - alphas, alphas - alpha_max)</w:t>
+        <w:br/>
+        <w:t xml:space="preserve">    worst = np.argmax(severity)</w:t>
+        <w:br/>
+        <w:t xml:space="preserve">    if severity[worst] &gt; 0:</w:t>
+        <w:br/>
+        <w:t xml:space="preserve">        z_poly = np.delete(z_poly, worst)   # drop the offending vertex</w:t>
+        <w:br/>
+        <w:t xml:space="preserve">        changed = True</w:t>
+        <w:br/>
+        <w:t># Boulder: 1935 raw -&gt; ~14 after D-P -&gt; 11 after angle smoothing</w:t>
+      </w:r>
+    </w:p>
+    <w:p>
+      <w:r>
+        <w:t>This is the single most important pre-processing step. Without it the SC solver will appear to converge but the forward map will be badly distorted near the removed vertices. The actual thresholds used are [0.35*pi, 1.75*pi] (see main.py --min-vertices / --max-vertices flags).</w:t>
+      </w:r>
+    </w:p>
+    <w:p>
+      <w:r/>
     </w:p>
     <w:p>
       <w:pPr>
@@ -7912,7 +7978,7 @@
           <w:sz w:val="19"/>
           <w:szCs w:val="19"/>
         </w:rPr>
-        <w:t xml:space="preserve">from scipy.optimize import fsolve</w:t>
+        <w:t>from scipy.optimize import least_squares</w:t>
       </w:r>
     </w:p>
     <w:p>
@@ -8137,7 +8203,15 @@
           <w:sz w:val="19"/>
           <w:szCs w:val="19"/>
         </w:rPr>
-        <w:t xml:space="preserve">    # Reconstruct full zk (3 fixed by Mobius normalization: 0, 1, inf)</w:t>
+        <w:t xml:space="preserve">    # Reconstruct full zk:</w:t>
+        <w:br/>
+        <w:t xml:space="preserve">    # Möbius normalisation fixes zk[0]=-1, zk[1]=0, zk[n-1]=1.</w:t>
+        <w:br/>
+        <w:t xml:space="preserve">    # Remaining n-3 free pre-vertices are in (-1, 0) ∪ (0, 1),</w:t>
+        <w:br/>
+        <w:t xml:space="preserve">    # reparameterised via softmax so they stay strictly ordered</w:t>
+        <w:br/>
+        <w:t xml:space="preserve">    # without explicit box constraints (smooth, differentiable).</w:t>
       </w:r>
     </w:p>
     <w:p>
@@ -8555,6 +8629,11 @@
           <w:szCs w:val="19"/>
         </w:rPr>
         <w:t xml:space="preserve">    return np.array(results)</w:t>
+      </w:r>
+    </w:p>
+    <w:p>
+      <w:r>
+        <w:t>Determining A and C: once zk is solved, A and C are found by an overdetermined least-squares fit. For each of the n polygon vertices compute the SC integral from a fixed reference point zeta_ref = 0.5j (safely in ℍ, away from all branch points): I_k = integral_{zeta_ref}^{zk[k] + 0.05j} integrand dt. Then solve the (2n x 2)-real linear system  A + C * I_k = z_poly[k] for k=0..n-1 in the least-squares sense. This globally minimises vertex error rather than enforcing only two calibration points. See src/sc_solver.py _solve_AC().</w:t>
       </w:r>
     </w:p>
     <w:p>
@@ -10901,7 +10980,7 @@
     </w:p>
     <w:p>
       <w:r>
-        <w:t xml:space="preserve">Streamlines under </w:t>
+        <w:t>Streamlines under the terrain-corrected potential. Implementation pipeline in src/terrain.py: (1) query USGS 3DEP EPQS API at vertices + 3 interpolation points per edge + 25 interior grid points (total ~69 points); (2) fill API failures with a linear west-high east-low Boulder model; (3) fit a 2-D thin-plate-spline RBF to all samples, validated with 5-fold cross-validation (CV R² logged at runtime); (4) compute per-vertex elevation gradients via 100m centred finite differences on the RBF surface; (5) project each gradient onto the flow direction (east) to get signed source strength q_k = Q_scale * (grad . e_flow) / max|grad|; (6) place one source (q&gt;0) or sink (q&lt;0) per vertex at s_k = zk[k] + 0.25j in ℍ with its image below ℝ. Q_scale=0.35 caps the maximum source at 35% of free-stream speed. Red triangles mark the highest vertices (~1770m, west); blue triangles the lowest (~1570m, east).</w:t>
       </w:r>
       <m:oMath>
         <m:r>
@@ -11089,9 +11168,7 @@
           </m:e>
         </m:d>
       </m:oMath>
-      <w:r>
-        <w:t>. Elevation data from USGS 3DEP is queried at all sample points (vertices + boundary + interior grid, total count logged at runtime) and fitted with a thin-plate-spline RBF. The 5-fold CV R² (reported in the log) measures genuine generalisation; typical values ~0.85-0.95 for Boulder. Green streamlines deflect toward lower-elevation sectors.</w:t>
-      </w:r>
+      <w:r/>
     </w:p>
     <w:p>
       <w:pPr>

</xml_diff>